<commit_message>
Update checklists QT.04, QT.05, QT.08 to latest revisions
Refreshes the Trench Excavation, Cable Laying and Cable Termination
checklist Word files with the latest versions from the Quality Team.

Co-Authored-By: Claude Fable 5 <noreply@anthropic.com>
</commit_message>
<xml_diff>
--- a/documents/checklists/PP.PPS.PTS.QT.04-Trench-Excavation-Pre-Execution-Checklist.docx
+++ b/documents/checklists/PP.PPS.PTS.QT.04-Trench-Excavation-Pre-Execution-Checklist.docx
@@ -2065,11 +2065,7 @@
           <w:tcPr>
             <w:tcW w:w="3420" w:type="dxa"/>
           </w:tcPr>
-          <w:p>
-            <w:r>
-              <w:t>Hamad Sultan</w:t>
-            </w:r>
-          </w:p>
+          <w:p/>
         </w:tc>
       </w:tr>
       <w:tr>
@@ -2110,68 +2106,7 @@
           <w:tcPr>
             <w:tcW w:w="3420" w:type="dxa"/>
           </w:tcPr>
-          <w:p>
-            <w:r>
-              <w:rPr>
-                <w:noProof/>
-              </w:rPr>
-              <w:drawing>
-                <wp:anchor distT="0" distB="0" distL="114300" distR="114300" simplePos="0" relativeHeight="251659264" behindDoc="1" locked="0" layoutInCell="1" allowOverlap="1" wp14:anchorId="6274D88C" wp14:editId="37A45863">
-                  <wp:simplePos x="0" y="0"/>
-                  <wp:positionH relativeFrom="column">
-                    <wp:posOffset>-3175</wp:posOffset>
-                  </wp:positionH>
-                  <wp:positionV relativeFrom="paragraph">
-                    <wp:posOffset>-635</wp:posOffset>
-                  </wp:positionV>
-                  <wp:extent cx="999750" cy="488982"/>
-                  <wp:effectExtent l="0" t="0" r="0" b="6350"/>
-                  <wp:wrapNone/>
-                  <wp:docPr id="2" name="Picture 2"/>
-                  <wp:cNvGraphicFramePr>
-                    <a:graphicFrameLocks xmlns:a="http://schemas.openxmlformats.org/drawingml/2006/main" noChangeAspect="1"/>
-                  </wp:cNvGraphicFramePr>
-                  <a:graphic xmlns:a="http://schemas.openxmlformats.org/drawingml/2006/main">
-                    <a:graphicData uri="http://schemas.openxmlformats.org/drawingml/2006/picture">
-                      <pic:pic xmlns:pic="http://schemas.openxmlformats.org/drawingml/2006/picture">
-                        <pic:nvPicPr>
-                          <pic:cNvPr id="1" name=""/>
-                          <pic:cNvPicPr/>
-                        </pic:nvPicPr>
-                        <pic:blipFill>
-                          <a:blip r:embed="rId7">
-                            <a:extLst>
-                              <a:ext uri="{28A0092B-C50C-407E-A947-70E740481C1C}">
-                                <a14:useLocalDpi xmlns:a14="http://schemas.microsoft.com/office/drawing/2010/main" val="0"/>
-                              </a:ext>
-                            </a:extLst>
-                          </a:blip>
-                          <a:stretch>
-                            <a:fillRect/>
-                          </a:stretch>
-                        </pic:blipFill>
-                        <pic:spPr>
-                          <a:xfrm>
-                            <a:off x="0" y="0"/>
-                            <a:ext cx="999750" cy="488982"/>
-                          </a:xfrm>
-                          <a:prstGeom prst="rect">
-                            <a:avLst/>
-                          </a:prstGeom>
-                        </pic:spPr>
-                      </pic:pic>
-                    </a:graphicData>
-                  </a:graphic>
-                  <wp14:sizeRelH relativeFrom="margin">
-                    <wp14:pctWidth>0</wp14:pctWidth>
-                  </wp14:sizeRelH>
-                  <wp14:sizeRelV relativeFrom="margin">
-                    <wp14:pctHeight>0</wp14:pctHeight>
-                  </wp14:sizeRelV>
-                </wp:anchor>
-              </w:drawing>
-            </w:r>
-          </w:p>
+          <w:p/>
         </w:tc>
       </w:tr>
     </w:tbl>
@@ -2183,7 +2118,7 @@
       </w:pPr>
     </w:p>
     <w:sectPr>
-      <w:headerReference w:type="default" r:id="rId8"/>
+      <w:headerReference w:type="default" r:id="rId7"/>
       <w:pgSz w:w="12240" w:h="15840"/>
       <w:pgMar w:top="1440" w:right="1440" w:bottom="180" w:left="1440" w:header="270" w:footer="720" w:gutter="0"/>
       <w:cols w:space="720"/>

</xml_diff>